<commit_message>
Route photo reports directly to human review
</commit_message>
<xml_diff>
--- a/docs/Planinng/UrMind Planejamento Completo.docx
+++ b/docs/Planinng/UrMind Planejamento Completo.docx
@@ -581,7 +581,7 @@
           <w:sz w:val="21"/>
           <w:szCs w:val="21"/>
         </w:rPr>
-        <w:t xml:space="preserve">A fila encaminha a captura para revisão humana. Ela não executa YOLOX, YOLO11 nem XGBoost.</w:t>
+        <w:t xml:space="preserve">A API registra a captura diretamente como pendente de revisão humana. Quando falta localização, o relato solicita o ponto antes da revisão. Não há inferência ativa de YOLOX, YOLO11 ou XGBoost.</w:t>
       </w:r>
     </w:p>
     <w:p>
@@ -616,7 +616,7 @@
           <w:sz w:val="21"/>
           <w:szCs w:val="21"/>
         </w:rPr>
-        <w:t xml:space="preserve">O frontend React é publicado separadamente da API FastAPI. Supabase mantém autenticação, banco geográfico, fila e armazenamento; Render hospeda a API. A interface e a API devem informar claramente quando uma análise automática não está disponível. Nenhum resultado antigo deve ser apresentado como capacidade atual.</w:t>
+        <w:t xml:space="preserve">O frontend React é publicado separadamente da API FastAPI. Supabase mantém autenticação, banco geográfico e armazenamento; Render hospeda a API. A antiga fila de inferência não recebe novas capturas. A interface e a API devem informar claramente quando uma análise automática não está disponível. Nenhum resultado antigo deve ser apresentado como capacidade atual.</w:t>
       </w:r>
     </w:p>
     <w:p>

</xml_diff>